<commit_message>
fix parser + writer bug
</commit_message>
<xml_diff>
--- a/template.docx
+++ b/template.docx
@@ -182,10 +182,10 @@
       <w:tblGrid>
         <w:gridCol w:w="1384"/>
         <w:gridCol w:w="1384"/>
-        <w:gridCol w:w="1384"/>
         <w:gridCol w:w="1385"/>
         <w:gridCol w:w="1384"/>
         <w:gridCol w:w="1384"/>
+        <w:gridCol w:w="1385"/>
       </w:tblGrid>
       <w:tr>
         <w:trPr/>
@@ -201,7 +201,6 @@
           <w:p>
             <w:pPr>
               <w:pStyle w:val="Normal"/>
-              <w:widowControl w:val="false"/>
               <w:spacing w:before="0" w:after="160"/>
               <w:jc w:val="center"/>
               <w:rPr/>
@@ -235,7 +234,6 @@
           <w:p>
             <w:pPr>
               <w:pStyle w:val="Normal"/>
-              <w:widowControl w:val="false"/>
               <w:spacing w:before="0" w:after="160"/>
               <w:jc w:val="center"/>
               <w:rPr/>
@@ -254,6 +252,39 @@
                 <w:lang w:bidi="ar-EG"/>
               </w:rPr>
               <w:t>:</w:t>
+            </w:r>
+          </w:p>
+        </w:tc>
+        <w:tc>
+          <w:tcPr>
+            <w:tcW w:w="1385" w:type="dxa"/>
+            <w:tcBorders>
+              <w:top w:val="single" w:sz="4" w:space="0" w:color="000000"/>
+              <w:left w:val="single" w:sz="4" w:space="0" w:color="000000"/>
+              <w:bottom w:val="single" w:sz="4" w:space="0" w:color="000000"/>
+            </w:tcBorders>
+          </w:tcPr>
+          <w:p>
+            <w:pPr>
+              <w:pStyle w:val="Normal"/>
+              <w:spacing w:before="0" w:after="160"/>
+              <w:jc w:val="center"/>
+              <w:rPr/>
+            </w:pPr>
+            <w:r>
+              <w:rPr>
+                <w:rtl w:val="true"/>
+                <w:lang w:bidi="ar-EG"/>
+              </w:rPr>
+              <w:t>الطراز</w:t>
+            </w:r>
+            <w:r>
+              <w:rPr>
+                <w:rFonts w:cs="Arial"/>
+                <w:rtl w:val="true"/>
+                <w:lang w:bidi="ar-EG"/>
+              </w:rPr>
+              <w:t xml:space="preserve">: </w:t>
             </w:r>
           </w:p>
         </w:tc>
@@ -269,41 +300,6 @@
           <w:p>
             <w:pPr>
               <w:pStyle w:val="Normal"/>
-              <w:widowControl w:val="false"/>
-              <w:spacing w:before="0" w:after="160"/>
-              <w:jc w:val="center"/>
-              <w:rPr/>
-            </w:pPr>
-            <w:r>
-              <w:rPr>
-                <w:rtl w:val="true"/>
-                <w:lang w:bidi="ar-EG"/>
-              </w:rPr>
-              <w:t>الطراز</w:t>
-            </w:r>
-            <w:r>
-              <w:rPr>
-                <w:rFonts w:cs="Arial"/>
-                <w:rtl w:val="true"/>
-                <w:lang w:bidi="ar-EG"/>
-              </w:rPr>
-              <w:t xml:space="preserve">: </w:t>
-            </w:r>
-          </w:p>
-        </w:tc>
-        <w:tc>
-          <w:tcPr>
-            <w:tcW w:w="1385" w:type="dxa"/>
-            <w:tcBorders>
-              <w:top w:val="single" w:sz="4" w:space="0" w:color="000000"/>
-              <w:left w:val="single" w:sz="4" w:space="0" w:color="000000"/>
-              <w:bottom w:val="single" w:sz="4" w:space="0" w:color="000000"/>
-            </w:tcBorders>
-          </w:tcPr>
-          <w:p>
-            <w:pPr>
-              <w:pStyle w:val="Normal"/>
-              <w:widowControl w:val="false"/>
               <w:spacing w:before="0" w:after="160"/>
               <w:jc w:val="center"/>
               <w:rPr/>
@@ -352,7 +348,6 @@
           <w:p>
             <w:pPr>
               <w:pStyle w:val="Normal"/>
-              <w:widowControl w:val="false"/>
               <w:spacing w:before="0" w:after="160"/>
               <w:jc w:val="center"/>
               <w:rPr/>
@@ -376,7 +371,7 @@
         </w:tc>
         <w:tc>
           <w:tcPr>
-            <w:tcW w:w="1384" w:type="dxa"/>
+            <w:tcW w:w="1385" w:type="dxa"/>
             <w:tcBorders>
               <w:top w:val="single" w:sz="4" w:space="0" w:color="000000"/>
               <w:left w:val="single" w:sz="4" w:space="0" w:color="000000"/>
@@ -387,7 +382,6 @@
           <w:p>
             <w:pPr>
               <w:pStyle w:val="Normal"/>
-              <w:widowControl w:val="false"/>
               <w:spacing w:before="0" w:after="160"/>
               <w:jc w:val="center"/>
               <w:rPr/>
@@ -423,7 +417,6 @@
           <w:p>
             <w:pPr>
               <w:pStyle w:val="Normal"/>
-              <w:widowControl w:val="false"/>
               <w:spacing w:before="0" w:after="160"/>
               <w:jc w:val="center"/>
               <w:rPr/>
@@ -471,7 +464,6 @@
           <w:p>
             <w:pPr>
               <w:pStyle w:val="Normal"/>
-              <w:widowControl w:val="false"/>
               <w:spacing w:before="0" w:after="160"/>
               <w:jc w:val="center"/>
               <w:rPr/>
@@ -497,6 +489,46 @@
                 <w:lang w:bidi="ar-EG"/>
               </w:rPr>
               <w:t>make</w:t>
+            </w:r>
+            <w:r>
+              <w:rPr>
+                <w:rFonts w:cs="Arial"/>
+                <w:rtl w:val="true"/>
+                <w:lang w:bidi="ar-EG"/>
+              </w:rPr>
+              <w:t>}</w:t>
+            </w:r>
+          </w:p>
+        </w:tc>
+        <w:tc>
+          <w:tcPr>
+            <w:tcW w:w="1385" w:type="dxa"/>
+            <w:tcBorders>
+              <w:left w:val="single" w:sz="4" w:space="0" w:color="000000"/>
+              <w:bottom w:val="single" w:sz="4" w:space="0" w:color="000000"/>
+            </w:tcBorders>
+          </w:tcPr>
+          <w:p>
+            <w:pPr>
+              <w:pStyle w:val="Normal"/>
+              <w:spacing w:before="0" w:after="160"/>
+              <w:jc w:val="center"/>
+              <w:rPr/>
+            </w:pPr>
+            <w:r>
+              <w:rPr>
+                <w:rFonts w:cs="Arial"/>
+                <w:rtl w:val="true"/>
+                <w:lang w:bidi="ar-EG"/>
+              </w:rPr>
+              <w:t>{</w:t>
+            </w:r>
+            <w:r>
+              <w:rPr>
+                <w:rFonts w:cs="Arial"/>
+                <w:lang w:bidi="ar-EG"/>
+              </w:rPr>
+              <w:t>model</w:t>
             </w:r>
             <w:r>
               <w:rPr>
@@ -519,48 +551,6 @@
           <w:p>
             <w:pPr>
               <w:pStyle w:val="Normal"/>
-              <w:widowControl w:val="false"/>
-              <w:spacing w:before="0" w:after="160"/>
-              <w:jc w:val="center"/>
-              <w:rPr/>
-            </w:pPr>
-            <w:r>
-              <w:rPr>
-                <w:rFonts w:cs="Arial"/>
-                <w:rtl w:val="true"/>
-                <w:lang w:bidi="ar-EG"/>
-              </w:rPr>
-              <w:t>{</w:t>
-            </w:r>
-            <w:r>
-              <w:rPr>
-                <w:rFonts w:cs="Arial"/>
-                <w:lang w:bidi="ar-EG"/>
-              </w:rPr>
-              <w:t>model</w:t>
-            </w:r>
-            <w:r>
-              <w:rPr>
-                <w:rFonts w:cs="Arial"/>
-                <w:rtl w:val="true"/>
-                <w:lang w:bidi="ar-EG"/>
-              </w:rPr>
-              <w:t>}</w:t>
-            </w:r>
-          </w:p>
-        </w:tc>
-        <w:tc>
-          <w:tcPr>
-            <w:tcW w:w="1385" w:type="dxa"/>
-            <w:tcBorders>
-              <w:left w:val="single" w:sz="4" w:space="0" w:color="000000"/>
-              <w:bottom w:val="single" w:sz="4" w:space="0" w:color="000000"/>
-            </w:tcBorders>
-          </w:tcPr>
-          <w:p>
-            <w:pPr>
-              <w:pStyle w:val="Normal"/>
-              <w:widowControl w:val="false"/>
               <w:spacing w:before="0" w:after="160"/>
               <w:jc w:val="center"/>
               <w:rPr/>
@@ -608,7 +598,6 @@
           <w:p>
             <w:pPr>
               <w:pStyle w:val="Normal"/>
-              <w:widowControl w:val="false"/>
               <w:spacing w:before="0" w:after="160"/>
               <w:jc w:val="center"/>
               <w:rPr/>
@@ -640,7 +629,7 @@
         </w:tc>
         <w:tc>
           <w:tcPr>
-            <w:tcW w:w="1384" w:type="dxa"/>
+            <w:tcW w:w="1385" w:type="dxa"/>
             <w:tcBorders>
               <w:left w:val="single" w:sz="4" w:space="0" w:color="000000"/>
               <w:bottom w:val="single" w:sz="4" w:space="0" w:color="000000"/>
@@ -650,7 +639,6 @@
           <w:p>
             <w:pPr>
               <w:pStyle w:val="Normal"/>
-              <w:widowControl w:val="false"/>
               <w:spacing w:before="0" w:after="160"/>
               <w:jc w:val="center"/>
               <w:rPr/>
@@ -699,9 +687,7 @@
       </w:pPr>
       <w:r>
         <w:rPr>
-          <w:rFonts w:cs="Arial"/>
-          <w:rtl w:val="true"/>
-          <w:lang w:bidi="ar-EG"/>
+          <w:rtl w:val="true"/>
         </w:rPr>
       </w:r>
     </w:p>

</xml_diff>